<commit_message>
Conform Bab I to Panduan TA SI Universitas Muhammadiyah Jember template
Rewrites skripsi/bab_1_pendahuluan.md to match the uploaded institutional
guideline (Panduan TA SI - 2026): subbab structure limited to Latar
Belakang, Rumusan Masalah, Tujuan Penelitian, Manfaat Penelitian, and
Batasan Masalah (drops Sistematika Penulisan, not part of the required
Bab 1 sections); heading rendered as "BAB 1" / "PENDAHULUAN"; in-text
citations switched to Indonesian style (dan/dkk instead of &/et al.);
foreign terms italicized.

Also updates convert_skripsi_bab_to_docx.py to enforce the template's
formatting rules: A4 page with 4/3/3/3 cm margins, Times New Roman 12pt
bold headings (BAB centered/caps, subbab left-aligned/title case), 1.5
line spacing, justified body text with no first-line indent, and a
bottom-right Arabic page number field in the footer.

Co-Authored-By: Claude Sonnet 5 <noreply@anthropic.com>
Claude-Session: https://claude.ai/code/session_012GsMtoJaFpqnvD8d8kDjDX
</commit_message>
<xml_diff>
--- a/skripsi/bab_1_pendahuluan.docx
+++ b/skripsi/bab_1_pendahuluan.docx
@@ -8,20 +8,47 @@
         <w:jc w:val="center"/>
       </w:pPr>
       <w:r>
-        <w:t>BAB I PENDAHULUAN</w:t>
+        <w:rPr>
+          <w:rFonts w:ascii="Times New Roman" w:hAnsi="Times New Roman"/>
+          <w:b/>
+          <w:color w:val="000000"/>
+          <w:sz w:val="24"/>
+        </w:rPr>
+        <w:t>BAB 1</w:t>
+      </w:r>
+    </w:p>
+    <w:p>
+      <w:pPr>
+        <w:pStyle w:val="Heading1"/>
+        <w:jc w:val="center"/>
+      </w:pPr>
+      <w:r>
+        <w:rPr>
+          <w:rFonts w:ascii="Times New Roman" w:hAnsi="Times New Roman"/>
+          <w:b/>
+          <w:color w:val="000000"/>
+          <w:sz w:val="24"/>
+        </w:rPr>
+        <w:t>PENDAHULUAN</w:t>
       </w:r>
     </w:p>
     <w:p>
       <w:pPr>
         <w:pStyle w:val="Heading2"/>
+        <w:jc w:val="left"/>
       </w:pPr>
       <w:r>
+        <w:rPr>
+          <w:rFonts w:ascii="Times New Roman" w:hAnsi="Times New Roman"/>
+          <w:b/>
+          <w:color w:val="000000"/>
+          <w:sz w:val="24"/>
+        </w:rPr>
         <w:t>1.1 Latar Belakang</w:t>
       </w:r>
     </w:p>
     <w:p>
       <w:pPr>
-        <w:ind w:firstLine="720"/>
         <w:jc w:val="both"/>
       </w:pPr>
       <w:r>
@@ -30,52 +57,154 @@
     </w:p>
     <w:p>
       <w:pPr>
-        <w:ind w:firstLine="720"/>
         <w:jc w:val="both"/>
       </w:pPr>
       <w:r>
-        <w:t>Penelitian analisis sentimen menggunakan metode machine learning, khususnya Support Vector Machine (SVM), telah banyak dilakukan pada berbagai isu kebijakan pemerintah di Indonesia, misalnya pada isu kinerja kementerian, kebijakan fiskal, hingga reshuffle kabinet. Mayoritas penelitian tersebut mengikuti pola yang seragam. Data dikumpulkan, dilabeli, digunakan untuk melatih model klasifikasi, kemudian dilaporkan metrik performanya. Proses pelabelan itu sendiri jarang dipertanyakan sebagai sumber bias yang berpotensi mempengaruhi hasil akhir, padahal proses ini menjadi fondasi dari seluruh pipeline analisis sentimen berbasis supervised learning. Kesalahan pada tahap pelabelan akan diwariskan ke tahap-tahap berikutnya tanpa disadari.</w:t>
+        <w:t xml:space="preserve">Penelitian analisis sentimen menggunakan metode </w:t>
+      </w:r>
+      <w:r>
+        <w:rPr>
+          <w:i/>
+        </w:rPr>
+        <w:t>machine learning</w:t>
+      </w:r>
+      <w:r>
+        <w:t xml:space="preserve">, khususnya </w:t>
+      </w:r>
+      <w:r>
+        <w:rPr>
+          <w:i/>
+        </w:rPr>
+        <w:t>Support Vector Machine</w:t>
+      </w:r>
+      <w:r>
+        <w:t xml:space="preserve"> (SVM), telah banyak dilakukan pada berbagai isu kebijakan pemerintah di Indonesia, misalnya pada isu kinerja kementerian, kebijakan fiskal, hingga reshuffle kabinet. Mayoritas penelitian tersebut mengikuti pola yang seragam. Data dikumpulkan, dilabeli, digunakan untuk melatih model klasifikasi, kemudian dilaporkan metrik performanya. Proses pelabelan itu sendiri jarang dipertanyakan sebagai sumber bias yang berpotensi mempengaruhi hasil akhir, padahal proses ini menjadi fondasi dari seluruh </w:t>
+      </w:r>
+      <w:r>
+        <w:rPr>
+          <w:i/>
+        </w:rPr>
+        <w:t>pipeline</w:t>
+      </w:r>
+      <w:r>
+        <w:t xml:space="preserve"> analisis sentimen berbasis </w:t>
+      </w:r>
+      <w:r>
+        <w:rPr>
+          <w:i/>
+        </w:rPr>
+        <w:t>supervised learning</w:t>
+      </w:r>
+      <w:r>
+        <w:t>. Kesalahan pada tahap pelabelan akan diwariskan ke tahap-tahap berikutnya tanpa disadari.</w:t>
       </w:r>
     </w:p>
     <w:p>
       <w:pPr>
-        <w:ind w:firstLine="720"/>
         <w:jc w:val="both"/>
       </w:pPr>
       <w:r>
-        <w:t>Seiring berkembangnya teknologi kecerdasan buatan generatif, pelabelan data berbantuan AI (AI-assisted labeling) mulai banyak digunakan sebagai alternatif pelabelan manual penuh yang memakan waktu dan biaya besar. Nasution &amp; Onan (2024) dalam studinya yang diterbitkan di IEEE Access membandingkan kualitas label yang dihasilkan manusia dengan label yang dihasilkan Large Language Model (LLM) pada tugas NLP bahasa bersumber daya rendah (low-resource language). Studi tersebut menemukan bahwa label AI dapat mendekati kualitas label manusia, namun tetap memiliki celah pada kasus-kasus linguistik yang kompleks. Studi lain juga menunjukkan bahwa LLM sebagai anotator memiliki keterbatasan signifikan ketika diterapkan pada bahasa bersumber daya rendah, terutama pada teks informal dan konteks budaya yang spesifik.</w:t>
+        <w:t>Seiring berkembangnya teknologi kecerdasan buatan generatif, pelabelan data berbantuan AI (</w:t>
+      </w:r>
+      <w:r>
+        <w:rPr>
+          <w:i/>
+        </w:rPr>
+        <w:t>AI-assisted labeling</w:t>
+      </w:r>
+      <w:r>
+        <w:t xml:space="preserve">) mulai banyak digunakan sebagai alternatif pelabelan manual penuh yang memakan waktu dan biaya besar. Nasution dan Onan (2024) dalam studinya yang diterbitkan di </w:t>
+      </w:r>
+      <w:r>
+        <w:rPr>
+          <w:i/>
+        </w:rPr>
+        <w:t>IEEE Access</w:t>
+      </w:r>
+      <w:r>
+        <w:t xml:space="preserve"> membandingkan kualitas label yang dihasilkan manusia dengan label yang dihasilkan </w:t>
+      </w:r>
+      <w:r>
+        <w:rPr>
+          <w:i/>
+        </w:rPr>
+        <w:t>Large Language Model</w:t>
+      </w:r>
+      <w:r>
+        <w:t xml:space="preserve"> (LLM) pada tugas pemrosesan bahasa alami untuk bahasa bersumber daya rendah (</w:t>
+      </w:r>
+      <w:r>
+        <w:rPr>
+          <w:i/>
+        </w:rPr>
+        <w:t>low-resource language</w:t>
+      </w:r>
+      <w:r>
+        <w:t>). Studi tersebut menemukan bahwa label AI dapat mendekati kualitas label manusia, namun tetap memiliki celah pada kasus-kasus linguistik yang kompleks. Jadhav dkk. (2025) juga menunjukkan bahwa LLM sebagai anotator memiliki keterbatasan signifikan ketika diterapkan pada bahasa bersumber daya rendah, terutama pada teks informal dan konteks budaya yang spesifik.</w:t>
       </w:r>
     </w:p>
     <w:p>
       <w:pPr>
-        <w:ind w:firstLine="720"/>
         <w:jc w:val="both"/>
       </w:pPr>
       <w:r>
-        <w:t>Pada praktiknya, tidak semua pendekatan berbantuan AI menggunakan model bahasa besar yang sesungguhnya. Banyak pipeline penelitian, termasuk yang digunakan dalam penyusunan dataset penelitian ini, menerapkan pendekatan pelabelan awal semi-otomatis berbasis aturan (rule-based/heuristik kata kunci) sebagai tahap percepatan sebelum dilakukan adjudikasi (peninjauan ulang) oleh manusia. Pendekatan semacam ini belum banyak diteliti secara eksplisit dari sisi keandalannya, khususnya terkait pola kesalahan sistematis yang mungkin ditinggalkannya.</w:t>
+        <w:t xml:space="preserve">Pada praktiknya, tidak semua pendekatan berbantuan AI menggunakan model bahasa besar yang sesungguhnya. Banyak </w:t>
+      </w:r>
+      <w:r>
+        <w:rPr>
+          <w:i/>
+        </w:rPr>
+        <w:t>pipeline</w:t>
+      </w:r>
+      <w:r>
+        <w:t xml:space="preserve"> penelitian, termasuk yang digunakan dalam penyusunan dataset penelitian ini, menerapkan pendekatan pelabelan awal semi-otomatis berbasis aturan (</w:t>
+      </w:r>
+      <w:r>
+        <w:rPr>
+          <w:i/>
+        </w:rPr>
+        <w:t>rule-based</w:t>
+      </w:r>
+      <w:r>
+        <w:t>) menggunakan heuristik kata kunci sebagai tahap percepatan sebelum dilakukan adjudikasi atau peninjauan ulang oleh manusia. Pendekatan semacam ini belum banyak diteliti secara eksplisit dari sisi keandalannya, khususnya terkait pola kesalahan sistematis yang mungkin ditinggalkannya.</w:t>
       </w:r>
     </w:p>
     <w:p>
       <w:pPr>
-        <w:ind w:firstLine="720"/>
         <w:jc w:val="both"/>
       </w:pPr>
       <w:r>
-        <w:t>Observasi awal terhadap dataset penelitian ini menunjukkan indikasi ke arah tersebut. Dari 1.000 sampel data yang melalui proses pelabelan awal semi-otomatis dan kemudian diadjudikasi secara manual, tingkat kesepakatan (agreement) antara label awal dan label akhir tercatat sebesar 92,5%, dengan nilai Cohen's Kappa sebesar 0,868. Nilai ini termasuk kategori kesepakatan "hampir sempurna" menurut skala Landis &amp; Koch. Meskipun angka tersebut tampak tinggi, seluruh 75 kasus ketidaksepakatan berasal dari label awal "netral" yang dikoreksi menjadi kelas lain saat adjudikasi manual. Sebanyak 67 di antaranya dikoreksi menjadi "negatif" dan hanya 8 menjadi "positif". Akibatnya, proporsi kelas negatif meningkat lebih dari dua kali lipat, dari 4,9% pada label awal menjadi 11,6% pada label akhir. Pola ini mengindikasikan bahwa pelabelan semi-otomatis secara sistematis cenderung menyembunyikan sinyal sentimen negatif ke dalam kelas netral sebagai nilai default, bukan salah mengklasifikasikannya secara acak ke berbagai arah.</w:t>
+        <w:t>Observasi awal terhadap dataset penelitian ini menunjukkan indikasi ke arah tersebut. Dari 1.000 sampel data yang melalui proses pelabelan awal semi-otomatis dan kemudian diadjudikasi secara manual, tingkat kesepakatan antara label awal dan label akhir tercatat sebesar 92,5%, dengan nilai Cohen's Kappa sebesar 0,868. Nilai ini termasuk kategori kesepakatan hampir sempurna menurut skala Landis dan Koch (1977). Meskipun angka tersebut tampak tinggi, seluruh 75 kasus ketidaksepakatan berasal dari label awal netral yang dikoreksi menjadi kelas lain saat adjudikasi manual. Sebanyak 67 di antaranya dikoreksi menjadi negatif dan hanya 8 menjadi positif. Akibatnya, proporsi kelas negatif meningkat lebih dari dua kali lipat, dari 4,9% pada label awal menjadi 11,6% pada label akhir. Pola ini mengindikasikan bahwa pelabelan semi-otomatis secara sistematis cenderung menyembunyikan sinyal sentimen negatif ke dalam kelas netral sebagai nilai bawaan, bukan salah mengklasifikasikannya secara acak ke berbagai arah.</w:t>
       </w:r>
     </w:p>
     <w:p>
       <w:pPr>
-        <w:ind w:firstLine="720"/>
         <w:jc w:val="both"/>
       </w:pPr>
       <w:r>
-        <w:t>Temuan tersebut relevan dengan permasalahan ketidakseimbangan kelas (class imbalance) yang umum dijumpai pada penelitian analisis sentimen kebijakan pemerintah di Indonesia. Pada kasus-kasus tersebut, kelas minoritas (dalam penelitian ini adalah kelas negatif) secara konsisten menunjukkan performa klasifikasi yang lebih rendah dibandingkan kelas mayoritas. Henning et al. (2023) dalam tinjauan sistematisnya mengenai penanganan class imbalance pada NLP berbasis deep learning menekankan bahwa sumber ketidakseimbangan kelas tidak selalu bersifat alami dari distribusi data, tetapi dapat pula berasal dari proses anotasi yang bias. Kesulitan mendeteksi sentimen negatif pada teks media sosial berbahasa Indonesia juga erat kaitannya dengan fenomena sarkasme dan sentimen implisit, sebagaimana dibahas dalam berbagai literatur mengenai deteksi sarkasme pada analisis sentimen.</w:t>
+        <w:t>Temuan tersebut relevan dengan permasalahan ketidakseimbangan kelas (</w:t>
+      </w:r>
+      <w:r>
+        <w:rPr>
+          <w:i/>
+        </w:rPr>
+        <w:t>class imbalance</w:t>
+      </w:r>
+      <w:r>
+        <w:t xml:space="preserve">) yang umum dijumpai pada penelitian analisis sentimen kebijakan pemerintah di Indonesia. Pada kasus-kasus tersebut, kelas minoritas, dalam penelitian ini adalah kelas negatif, secara konsisten menunjukkan performa klasifikasi yang lebih rendah dibandingkan kelas mayoritas. Henning dkk. (2023) dalam tinjauan sistematisnya mengenai penanganan ketidakseimbangan kelas pada pemrosesan bahasa alami berbasis </w:t>
+      </w:r>
+      <w:r>
+        <w:rPr>
+          <w:i/>
+        </w:rPr>
+        <w:t>deep learning</w:t>
+      </w:r>
+      <w:r>
+        <w:t xml:space="preserve"> menekankan bahwa sumber ketidakseimbangan kelas tidak selalu bersifat alami dari distribusi data, tetapi dapat pula berasal dari proses anotasi yang bias. Kesulitan mendeteksi sentimen negatif pada teks media sosial berbahasa Indonesia juga erat kaitannya dengan fenomena sarkasme dan sentimen implisit, sebagaimana dibahas dalam berbagai literatur mengenai deteksi sarkasme pada analisis sentimen.</w:t>
       </w:r>
     </w:p>
     <w:p>
       <w:pPr>
-        <w:ind w:firstLine="720"/>
         <w:jc w:val="both"/>
       </w:pPr>
       <w:r>
@@ -84,7 +213,6 @@
     </w:p>
     <w:p>
       <w:pPr>
-        <w:ind w:firstLine="720"/>
         <w:jc w:val="both"/>
       </w:pPr>
       <w:r>
@@ -94,14 +222,20 @@
     <w:p>
       <w:pPr>
         <w:pStyle w:val="Heading2"/>
+        <w:jc w:val="left"/>
       </w:pPr>
       <w:r>
+        <w:rPr>
+          <w:rFonts w:ascii="Times New Roman" w:hAnsi="Times New Roman"/>
+          <w:b/>
+          <w:color w:val="000000"/>
+          <w:sz w:val="24"/>
+        </w:rPr>
         <w:t>1.2 Rumusan Masalah</w:t>
       </w:r>
     </w:p>
     <w:p>
       <w:pPr>
-        <w:ind w:firstLine="720"/>
         <w:jc w:val="both"/>
       </w:pPr>
       <w:r>
@@ -114,7 +248,7 @@
         <w:jc w:val="both"/>
       </w:pPr>
       <w:r>
-        <w:t>Seberapa tinggi tingkat kesepakatan (agreement) antara label hasil pelabelan semi-otomatis (pra-pelabelan) dengan label akhir hasil adjudikasi manual pada dataset opini publik Program MBG, diukur menggunakan Cohen's Kappa?</w:t>
+        <w:t>Seberapa tinggi tingkat kesepakatan antara label hasil pelabelan semi-otomatis dengan label akhir hasil adjudikasi manual pada dataset opini publik Program MBG, diukur menggunakan Cohen's Kappa?</w:t>
       </w:r>
     </w:p>
     <w:p>
@@ -141,20 +275,35 @@
         <w:jc w:val="both"/>
       </w:pPr>
       <w:r>
-        <w:t>Bagaimana performa model TF-IDF + SVM (baseline maupun hasil tuning) dalam mengklasifikasikan sentimen publik terhadap Program MBG ke dalam kelas positif, negatif, dan netral, khususnya pada kelas minoritas?</w:t>
+        <w:t xml:space="preserve">Bagaimana performa model TF-IDF dan SVM, baik pada konfigurasi awal maupun hasil </w:t>
+      </w:r>
+      <w:r>
+        <w:rPr>
+          <w:i/>
+        </w:rPr>
+        <w:t>tuning</w:t>
+      </w:r>
+      <w:r>
+        <w:t>, dalam mengklasifikasikan sentimen publik terhadap Program MBG ke dalam kelas positif, negatif, dan netral, khususnya pada kelas minoritas?</w:t>
       </w:r>
     </w:p>
     <w:p>
       <w:pPr>
         <w:pStyle w:val="Heading2"/>
+        <w:jc w:val="left"/>
       </w:pPr>
       <w:r>
+        <w:rPr>
+          <w:rFonts w:ascii="Times New Roman" w:hAnsi="Times New Roman"/>
+          <w:b/>
+          <w:color w:val="000000"/>
+          <w:sz w:val="24"/>
+        </w:rPr>
         <w:t>1.3 Tujuan Penelitian</w:t>
       </w:r>
     </w:p>
     <w:p>
       <w:pPr>
-        <w:ind w:firstLine="720"/>
         <w:jc w:val="both"/>
       </w:pPr>
       <w:r>
@@ -194,46 +343,66 @@
         <w:jc w:val="both"/>
       </w:pPr>
       <w:r>
-        <w:t>Membangun dan mengevaluasi model klasifikasi sentimen berbasis TF-IDF dan SVM, termasuk hasil tuning hyperparameter, terhadap data opini publik Program MBG.</w:t>
+        <w:t xml:space="preserve">Membangun dan mengevaluasi model klasifikasi sentimen berbasis TF-IDF dan SVM, termasuk hasil </w:t>
+      </w:r>
+      <w:r>
+        <w:rPr>
+          <w:i/>
+        </w:rPr>
+        <w:t>tuning</w:t>
+      </w:r>
+      <w:r>
+        <w:t xml:space="preserve"> hyperparameter, terhadap data opini publik Program MBG.</w:t>
       </w:r>
     </w:p>
     <w:p>
       <w:pPr>
         <w:pStyle w:val="Heading2"/>
+        <w:jc w:val="left"/>
       </w:pPr>
       <w:r>
+        <w:rPr>
+          <w:rFonts w:ascii="Times New Roman" w:hAnsi="Times New Roman"/>
+          <w:b/>
+          <w:color w:val="000000"/>
+          <w:sz w:val="24"/>
+        </w:rPr>
         <w:t>1.4 Manfaat Penelitian</w:t>
       </w:r>
     </w:p>
     <w:p>
       <w:pPr>
-        <w:ind w:firstLine="720"/>
         <w:jc w:val="both"/>
       </w:pPr>
       <w:r>
-        <w:t>Manfaat Teoritis. Penelitian ini diharapkan memberikan kontribusi metodologis pada bidang analisis sentimen. Kontribusi tersebut berupa evaluasi keandalan pendekatan pelabelan semi-otomatis dan keterkaitannya dengan permasalahan ketidakseimbangan kelas, sebuah aspek yang belum banyak dieksplorasi secara eksplisit dalam literatur analisis sentimen berbahasa Indonesia.</w:t>
+        <w:t>Secara teoritis, penelitian ini diharapkan memberikan kontribusi metodologis pada bidang analisis sentimen, berupa evaluasi keandalan pendekatan pelabelan semi-otomatis dan keterkaitannya dengan permasalahan ketidakseimbangan kelas, sebuah aspek yang belum banyak dieksplorasi secara eksplisit dalam literatur analisis sentimen berbahasa Indonesia.</w:t>
       </w:r>
     </w:p>
     <w:p>
       <w:pPr>
-        <w:ind w:firstLine="720"/>
         <w:jc w:val="both"/>
       </w:pPr>
       <w:r>
-        <w:t>Manfaat Praktis. Bagi pemangku kepentingan Program MBG, hasil analisis sentimen dapat menjadi salah satu masukan pemantauan opini publik. Bagi peneliti atau praktisi lain yang menggunakan pendekatan pelabelan semi-otomatis dalam menyusun dataset berlabel, penelitian ini memberikan gambaran empiris mengenai risiko bias yang perlu diantisipasi, khususnya pada teks berbahasa Indonesia informal.</w:t>
+        <w:t>Secara praktis, bagi pemangku kepentingan Program MBG, hasil analisis sentimen dapat menjadi salah satu masukan pemantauan opini publik. Bagi peneliti atau praktisi lain yang menggunakan pendekatan pelabelan semi-otomatis dalam menyusun dataset berlabel, penelitian ini memberikan gambaran empiris mengenai risiko bias yang perlu diantisipasi, khususnya pada teks berbahasa Indonesia informal.</w:t>
       </w:r>
     </w:p>
     <w:p>
       <w:pPr>
         <w:pStyle w:val="Heading2"/>
+        <w:jc w:val="left"/>
       </w:pPr>
       <w:r>
+        <w:rPr>
+          <w:rFonts w:ascii="Times New Roman" w:hAnsi="Times New Roman"/>
+          <w:b/>
+          <w:color w:val="000000"/>
+          <w:sz w:val="24"/>
+        </w:rPr>
         <w:t>1.5 Batasan Masalah</w:t>
       </w:r>
     </w:p>
     <w:p>
       <w:pPr>
-        <w:ind w:firstLine="720"/>
         <w:jc w:val="both"/>
       </w:pPr>
       <w:r>
@@ -264,7 +433,52 @@
         <w:jc w:val="both"/>
       </w:pPr>
       <w:r>
-        <w:t>Model klasifikasi yang dianalisis dibatasi pada keluarga SVM (Linear SVM, RBF SVM, dan hasil tuning-nya) dengan representasi fitur TF-IDF. Perbandingan dengan model deep learning atau transformer berada di luar cakupan penelitian ini.</w:t>
+        <w:t>Model klasifikasi yang dianalisis dibatasi pada keluarga SVM (</w:t>
+      </w:r>
+      <w:r>
+        <w:rPr>
+          <w:i/>
+        </w:rPr>
+        <w:t>Linear SVM</w:t>
+      </w:r>
+      <w:r>
+        <w:t xml:space="preserve">, </w:t>
+      </w:r>
+      <w:r>
+        <w:rPr>
+          <w:i/>
+        </w:rPr>
+        <w:t>RBF SVM</w:t>
+      </w:r>
+      <w:r>
+        <w:t xml:space="preserve">, dan hasil </w:t>
+      </w:r>
+      <w:r>
+        <w:rPr>
+          <w:i/>
+        </w:rPr>
+        <w:t>tuning</w:t>
+      </w:r>
+      <w:r>
+        <w:t xml:space="preserve">-nya) dengan representasi fitur TF-IDF. Perbandingan dengan model </w:t>
+      </w:r>
+      <w:r>
+        <w:rPr>
+          <w:i/>
+        </w:rPr>
+        <w:t>deep learning</w:t>
+      </w:r>
+      <w:r>
+        <w:t xml:space="preserve"> atau </w:t>
+      </w:r>
+      <w:r>
+        <w:rPr>
+          <w:i/>
+        </w:rPr>
+        <w:t>transformer</w:t>
+      </w:r>
+      <w:r>
+        <w:t xml:space="preserve"> berada di luar cakupan penelitian ini.</w:t>
       </w:r>
     </w:p>
     <w:p>
@@ -273,7 +487,16 @@
         <w:jc w:val="both"/>
       </w:pPr>
       <w:r>
-        <w:t>Analisis bias pelabelan difokuskan pada pendekatan semi-otomatis berbasis aturan yang telah diterapkan pada penyusunan dataset ini, bukan perbandingan berbagai jenis model AI-assisted labeling lain seperti LLM komersial.</w:t>
+        <w:t xml:space="preserve">Analisis bias pelabelan difokuskan pada pendekatan semi-otomatis berbasis aturan yang telah diterapkan pada penyusunan dataset ini, bukan perbandingan berbagai jenis model </w:t>
+      </w:r>
+      <w:r>
+        <w:rPr>
+          <w:i/>
+        </w:rPr>
+        <w:t>AI-assisted labeling</w:t>
+      </w:r>
+      <w:r>
+        <w:t xml:space="preserve"> lain seperti LLM komersial.</w:t>
       </w:r>
     </w:p>
     <w:p>
@@ -285,31 +508,35 @@
         <w:t>Hasil penelitian menggambarkan karakteristik sampel data yang digunakan dan tidak diklaim merepresentasikan opini publik Indonesia secara keseluruhan.</w:t>
       </w:r>
     </w:p>
-    <w:p>
-      <w:pPr>
-        <w:pStyle w:val="Heading2"/>
-      </w:pPr>
-      <w:r>
-        <w:t>1.6 Sistematika Penulisan</w:t>
-      </w:r>
-    </w:p>
-    <w:p>
-      <w:pPr>
-        <w:ind w:firstLine="720"/>
-        <w:jc w:val="both"/>
-      </w:pPr>
-      <w:r>
-        <w:t>Sistematika penulisan skripsi ini disesuaikan dengan template yang berlaku di institusi terkait, secara umum terdiri dari Bab I Pendahuluan, Bab II Tinjauan Pustaka, Bab III Metodologi Penelitian, Bab IV Hasil dan Pembahasan, dan Bab V Kesimpulan dan Saran.</w:t>
-      </w:r>
-    </w:p>
     <w:sectPr>
-      <w:pgSz w:w="12240" w:h="15840"/>
-      <w:pgMar w:top="1440" w:right="1800" w:bottom="1440" w:left="1800" w:header="720" w:footer="720" w:gutter="0"/>
+      <w:footerReference w:type="default" r:id="rId9"/>
+      <w:pgSz w:w="11906" w:h="16838"/>
+      <w:pgMar w:top="1701" w:right="1701" w:bottom="1701" w:left="2268" w:header="720" w:footer="720" w:gutter="0"/>
       <w:cols w:space="720"/>
       <w:docGrid w:linePitch="360"/>
     </w:sectPr>
   </w:body>
 </w:document>
+</file>
+
+<file path=word/footer1.xml><?xml version="1.0" encoding="utf-8"?>
+<w:ftr xmlns:m="http://schemas.openxmlformats.org/officeDocument/2006/math" xmlns:mc="http://schemas.openxmlformats.org/markup-compatibility/2006" xmlns:mo="http://schemas.microsoft.com/office/mac/office/2008/main" xmlns:mv="urn:schemas-microsoft-com:mac:vml" xmlns:o="urn:schemas-microsoft-com:office:office" xmlns:r="http://schemas.openxmlformats.org/officeDocument/2006/relationships" xmlns:v="urn:schemas-microsoft-com:vml" xmlns:w10="urn:schemas-microsoft-com:office:word" xmlns:w14="http://schemas.microsoft.com/office/word/2010/wordml" xmlns:w="http://schemas.openxmlformats.org/wordprocessingml/2006/main" xmlns:wne="http://schemas.microsoft.com/office/word/2006/wordml" xmlns:wp14="http://schemas.microsoft.com/office/word/2010/wordprocessingDrawing" xmlns:wp="http://schemas.openxmlformats.org/drawingml/2006/wordprocessingDrawing" xmlns:wpc="http://schemas.microsoft.com/office/word/2010/wordprocessingCanvas" xmlns:wpg="http://schemas.microsoft.com/office/word/2010/wordprocessingGroup" xmlns:wpi="http://schemas.microsoft.com/office/word/2010/wordprocessingInk" xmlns:wps="http://schemas.microsoft.com/office/word/2010/wordprocessingShape" mc:Ignorable="w14 wp14">
+  <w:p>
+    <w:pPr>
+      <w:pStyle w:val="Footer"/>
+      <w:jc w:val="right"/>
+    </w:pPr>
+    <w:r>
+      <w:rPr>
+        <w:rFonts w:ascii="Times New Roman" w:hAnsi="Times New Roman"/>
+        <w:sz w:val="24"/>
+      </w:rPr>
+      <w:fldChar w:fldCharType="begin"/>
+      <w:instrText xml:space="preserve">PAGE</w:instrText>
+      <w:fldChar w:fldCharType="end"/>
+    </w:r>
+  </w:p>
+</w:ftr>
 </file>
 
 <file path=word/numbering.xml><?xml version="1.0" encoding="utf-8"?>

</xml_diff>

<commit_message>
Correct labeling-process claims in Bab 1-3 and docs
The dataset labels are automatic (batch 001 by an LLM, batches 002-020 by
the keyword script), with AI-assisted review of 138 flagged rows and no
independent human gold standard. Remove the "manual adjudication" claim,
the Cohen's Kappa 0.868 / "bias sistematis" framing (the review only
covered flagged, mostly netral-labelled rows, so it cannot support them),
and reframe the RQs around evaluating automatic label quality against a
human-annotated random sample and its effect on SVM negative-class
performance. Bab 3 gains a gold-set annotation step. README and docs now
describe the process accurately.

Co-Authored-By: Claude Sonnet 5.5 <noreply@anthropic.com>
Claude-Session: https://claude.ai/code/session_012GsMtoJaFpqnvD8d8kDjDX
</commit_message>
<xml_diff>
--- a/skripsi/bab_1_pendahuluan.docx
+++ b/skripsi/bab_1_pendahuluan.docx
@@ -148,16 +148,7 @@
         <w:jc w:val="both"/>
       </w:pPr>
       <w:r>
-        <w:t xml:space="preserve">Pada praktiknya, tidak semua pendekatan berbantuan AI menggunakan model bahasa besar yang sesungguhnya. Banyak </w:t>
-      </w:r>
-      <w:r>
-        <w:rPr>
-          <w:i/>
-        </w:rPr>
-        <w:t>pipeline</w:t>
-      </w:r>
-      <w:r>
-        <w:t xml:space="preserve"> penelitian, termasuk yang digunakan dalam penyusunan dataset penelitian ini, menerapkan pendekatan pelabelan awal semi-otomatis berbasis aturan (</w:t>
+        <w:t>Pada praktiknya, penyusunan dataset berlabel sering menggabungkan beberapa mekanisme otomatis dengan peninjauan manusia yang terbatas, dan dataset penelitian ini disusun dengan cara tersebut. Label awal untuk 1.000 sampel dibuat secara otomatis. Batch pertama (50 sampel) dilabeli oleh model bahasa ChatGPT, sedangkan 19 batch berikutnya (950 sampel) dilabeli oleh skrip pencocokan kata kunci (</w:t>
       </w:r>
       <w:r>
         <w:rPr>
@@ -166,7 +157,16 @@
         <w:t>rule-based</w:t>
       </w:r>
       <w:r>
-        <w:t>) menggunakan heuristik kata kunci sebagai tahap percepatan sebelum dilakukan adjudikasi atau peninjauan ulang oleh manusia. Pendekatan semacam ini belum banyak diteliti secara eksplisit dari sisi keandalannya, khususnya terkait pola kesalahan sistematis yang mungkin ditinggalkannya.</w:t>
+        <w:t>). Baris yang dinilai ambigu ditandai untuk ditinjau ulang. Peninjauan tersebut sebagian besar dilakukan dengan bantuan AI dan disetujui oleh peneliti, sedangkan peninjauan langsung oleh peneliti hanya mencakup sebagian kecil sampel. Dengan demikian, dataset ini belum memiliki acuan (</w:t>
+      </w:r>
+      <w:r>
+        <w:rPr>
+          <w:i/>
+        </w:rPr>
+        <w:t>gold standard</w:t>
+      </w:r>
+      <w:r>
+        <w:t>) hasil anotasi manusia independen, sehingga keandalan label otomatisnya belum diketahui.</w:t>
       </w:r>
     </w:p>
     <w:p>
@@ -174,7 +174,7 @@
         <w:jc w:val="both"/>
       </w:pPr>
       <w:r>
-        <w:t>Observasi awal terhadap dataset penelitian ini menunjukkan indikasi ke arah tersebut. Dari 1.000 sampel data yang melalui proses pelabelan awal semi-otomatis dan kemudian diadjudikasi secara manual, tingkat kesepakatan antara label awal dan label akhir tercatat sebesar 92,5%, dengan nilai Cohen's Kappa sebesar 0,868. Nilai ini termasuk kategori kesepakatan hampir sempurna menurut skala Landis dan Koch (1977). Meskipun angka tersebut tampak tinggi, seluruh 75 kasus ketidaksepakatan berasal dari label awal netral yang dikoreksi menjadi kelas lain saat adjudikasi manual. Sebanyak 67 di antaranya dikoreksi menjadi negatif dan hanya 8 menjadi positif. Akibatnya, proporsi kelas negatif meningkat lebih dari dua kali lipat, dari 4,9% pada label awal menjadi 11,6% pada label akhir. Pola ini mengindikasikan bahwa pelabelan semi-otomatis secara sistematis cenderung menyembunyikan sinyal sentimen negatif ke dalam kelas netral sebagai nilai bawaan, bukan salah mengklasifikasikannya secara acak ke berbagai arah.</w:t>
+        <w:t>Observasi awal terhadap dataset penelitian ini memberikan indikasi bahwa label otomatis kurang andal pada kelas negatif. Dari 1.000 sampel, 138 baris (13,8%) ditandai ambigu dan ditinjau ulang, dan 75 di antaranya berubah label, yaitu 67 dari netral menjadi negatif dan 8 dari netral menjadi positif. Akibatnya, proporsi kelas negatif meningkat dari 4,9% pada label awal menjadi 11,6% pada label akhir. Namun demikian, peninjauan hanya dilakukan pada baris berlabel awal netral yang ditandai ambigu dan sebagian besar dibantu AI, sedangkan 862 baris lainnya tidak ditinjau. Oleh karena itu, temuan ini baru berupa indikasi dan belum dapat dikonfirmasi tanpa acuan hasil anotasi manusia yang independen.</w:t>
       </w:r>
     </w:p>
     <w:p>
@@ -182,7 +182,7 @@
         <w:jc w:val="both"/>
       </w:pPr>
       <w:r>
-        <w:t>Temuan tersebut relevan dengan permasalahan ketidakseimbangan kelas (</w:t>
+        <w:t>Indikasi tersebut relevan dengan permasalahan ketidakseimbangan kelas (</w:t>
       </w:r>
       <w:r>
         <w:rPr>
@@ -216,7 +216,7 @@
         <w:jc w:val="both"/>
       </w:pPr>
       <w:r>
-        <w:t>Berdasarkan uraian di atas, penelitian ini berupaya mengisi celah tersebut. Selain membangun model klasifikasi sentimen berbasis SVM terhadap opini publik Program MBG, penelitian ini juga menganalisis secara eksplisit apakah bias sistematis pada tahap pelabelan semi-otomatis berkontribusi terhadap kesulitan deteksi kelas sentimen negatif yang minoritas. Aspek metodologis ini belum banyak dibahas secara eksplisit dalam literatur analisis sentimen berbahasa Indonesia yang telah ada.</w:t>
+        <w:t>Berdasarkan uraian di atas, penelitian ini berupaya mengisi celah tersebut dengan mengevaluasi kualitas label otomatis terhadap acuan hasil anotasi manusia pada sampel acak, menganalisis pola perbedaannya, serta menguji dampaknya terhadap performa klasifikasi SVM pada kelas sentimen negatif yang minoritas. Aspek metodologis ini belum banyak dibahas secara eksplisit dalam literatur analisis sentimen berbahasa Indonesia yang telah ditinjau.</w:t>
       </w:r>
     </w:p>
     <w:p>
@@ -248,7 +248,7 @@
         <w:jc w:val="both"/>
       </w:pPr>
       <w:r>
-        <w:t>Seberapa tinggi tingkat kesepakatan antara label hasil pelabelan semi-otomatis dengan label akhir hasil adjudikasi manual pada dataset opini publik Program MBG, diukur menggunakan Cohen's Kappa?</w:t>
+        <w:t>Seberapa tinggi tingkat kesepakatan antara label otomatis, yaitu hasil pelabelan awal dan tinjauan berbantuan AI, dengan label acuan hasil anotasi manusia pada sampel acak dataset opini publik Program MBG, diukur menggunakan Cohen's Kappa?</w:t>
       </w:r>
     </w:p>
     <w:p>
@@ -257,7 +257,7 @@
         <w:jc w:val="both"/>
       </w:pPr>
       <w:r>
-        <w:t>Apakah terdapat pola kesalahan sistematis pada teks yang dikoreksi selama proses adjudikasi manual, dan bagaimana karakteristik pola tersebut?</w:t>
+        <w:t>Pada kelas dan pola teks apa saja label otomatis paling sering berbeda dari label acuan hasil anotasi manusia, terutama pada kelas negatif?</w:t>
       </w:r>
     </w:p>
     <w:p>
@@ -266,7 +266,7 @@
         <w:jc w:val="both"/>
       </w:pPr>
       <w:r>
-        <w:t>Apakah bias sistematis pada tahap pra-pelabelan berkontribusi terhadap rendahnya performa klasifikasi model SVM pada kelas sentimen negatif yang minoritas?</w:t>
+        <w:t>Seberapa besar perbedaan performa model SVM pada kelas sentimen negatif apabila dievaluasi terhadap label otomatis dibandingkan terhadap label acuan hasil anotasi manusia, serta apabila dilatih dengan label otomatis dibandingkan dengan label yang dikoreksi berdasarkan acuan tersebut?</w:t>
       </w:r>
     </w:p>
     <w:p>
@@ -316,7 +316,7 @@
         <w:jc w:val="both"/>
       </w:pPr>
       <w:r>
-        <w:t>Mengukur tingkat kesepakatan antara label pra-pelabelan semi-otomatis dan label hasil adjudikasi manual menggunakan Cohen's Kappa.</w:t>
+        <w:t>Mengukur tingkat kesepakatan antara label otomatis dan label acuan hasil anotasi manusia menggunakan Cohen's Kappa.</w:t>
       </w:r>
     </w:p>
     <w:p>
@@ -325,7 +325,7 @@
         <w:jc w:val="both"/>
       </w:pPr>
       <w:r>
-        <w:t>Mengidentifikasi dan mengkarakterisasi pola kesalahan sistematis yang muncul selama proses adjudikasi manual.</w:t>
+        <w:t>Mengidentifikasi dan mengkarakterisasi pola perbedaan antara label otomatis dan label acuan hasil anotasi manusia.</w:t>
       </w:r>
     </w:p>
     <w:p>
@@ -334,7 +334,7 @@
         <w:jc w:val="both"/>
       </w:pPr>
       <w:r>
-        <w:t>Menganalisis keterkaitan antara bias pada tahap pelabelan dengan performa klasifikasi model pada kelas sentimen negatif yang minoritas.</w:t>
+        <w:t>Menganalisis pengaruh kualitas label terhadap performa klasifikasi model SVM pada kelas sentimen negatif yang minoritas.</w:t>
       </w:r>
     </w:p>
     <w:p>
@@ -375,7 +375,7 @@
         <w:jc w:val="both"/>
       </w:pPr>
       <w:r>
-        <w:t>Secara teoritis, penelitian ini diharapkan memberikan kontribusi metodologis pada bidang analisis sentimen, berupa evaluasi keandalan pendekatan pelabelan semi-otomatis dan keterkaitannya dengan permasalahan ketidakseimbangan kelas, sebuah aspek yang belum banyak dieksplorasi secara eksplisit dalam literatur analisis sentimen berbahasa Indonesia.</w:t>
+        <w:t>Secara teoritis, penelitian ini diharapkan memberikan kontribusi metodologis pada bidang analisis sentimen, berupa evaluasi keandalan pelabelan otomatis terhadap acuan hasil anotasi manusia dan keterkaitannya dengan permasalahan ketidakseimbangan kelas, sebuah aspek yang belum banyak dieksplorasi secara eksplisit dalam literatur analisis sentimen berbahasa Indonesia.</w:t>
       </w:r>
     </w:p>
     <w:p>
@@ -383,7 +383,7 @@
         <w:jc w:val="both"/>
       </w:pPr>
       <w:r>
-        <w:t>Secara praktis, bagi pemangku kepentingan Program MBG, hasil analisis sentimen dapat menjadi salah satu masukan pemantauan opini publik. Bagi peneliti atau praktisi lain yang menggunakan pendekatan pelabelan semi-otomatis dalam menyusun dataset berlabel, penelitian ini memberikan gambaran empiris mengenai risiko bias yang perlu diantisipasi, khususnya pada teks berbahasa Indonesia informal.</w:t>
+        <w:t>Secara praktis, bagi pemangku kepentingan Program MBG, hasil analisis sentimen dapat menjadi salah satu masukan pemantauan opini publik. Bagi peneliti atau praktisi lain yang menyusun dataset berlabel dengan pelabelan otomatis, penelitian ini memberikan gambaran empiris mengenai risiko kesalahan label yang perlu diantisipasi, khususnya pada teks berbahasa Indonesia informal.</w:t>
       </w:r>
     </w:p>
     <w:p>
@@ -415,7 +415,16 @@
         <w:jc w:val="both"/>
       </w:pPr>
       <w:r>
-        <w:t>Data yang digunakan adalah sampel berlabel sejumlah 1.000 baris hasil crawling media sosial terkait Program MBG, bukan keseluruhan populasi opini publik.</w:t>
+        <w:t xml:space="preserve">Data yang digunakan adalah sampel sejumlah 1.000 baris dari dataset sekunder hasil </w:t>
+      </w:r>
+      <w:r>
+        <w:rPr>
+          <w:i/>
+        </w:rPr>
+        <w:t>crawling</w:t>
+      </w:r>
+      <w:r>
+        <w:t xml:space="preserve"> media sosial X terkait Program MBG, bukan keseluruhan populasi opini publik.</w:t>
       </w:r>
     </w:p>
     <w:p>
@@ -487,16 +496,16 @@
         <w:jc w:val="both"/>
       </w:pPr>
       <w:r>
-        <w:t xml:space="preserve">Analisis bias pelabelan difokuskan pada pendekatan semi-otomatis berbasis aturan yang telah diterapkan pada penyusunan dataset ini, bukan perbandingan berbagai jenis model </w:t>
+        <w:t>Label otomatis yang dievaluasi dibatasi pada proses yang telah diterapkan pada dataset ini, yaitu pelabelan awal oleh ChatGPT dan skrip kata kunci beserta tinjauan berbantuan AI. Perbandingan dengan model bahasa besar lain berada di luar cakupan penelitian ini.</w:t>
       </w:r>
+    </w:p>
+    <w:p>
+      <w:pPr>
+        <w:pStyle w:val="ListNumber"/>
+        <w:jc w:val="both"/>
+      </w:pPr>
       <w:r>
-        <w:rPr>
-          <w:i/>
-        </w:rPr>
-        <w:t>AI-assisted labeling</w:t>
-      </w:r>
-      <w:r>
-        <w:t xml:space="preserve"> lain seperti LLM komersial.</w:t>
+        <w:t>Label acuan hasil anotasi manusia disusun pada sampel acak terbatas dari 1.000 baris, sehingga estimasi kualitas label berlaku untuk sampel tersebut dan bergantung pada jumlah anotator yang tersedia.</w:t>
       </w:r>
     </w:p>
     <w:p>

</xml_diff>